<commit_message>
Implement go-live readiness gates
</commit_message>
<xml_diff>
--- a/docs/user-guide/Flux-LLM-KB-Dashboard-User-Manual.docx
+++ b/docs/user-guide/Flux-LLM-KB-Dashboard-User-Manual.docx
@@ -7687,20 +7687,7 @@
               <w:rPr>
                 <w:sz w:val="18"/>
               </w:rPr>
-              <w:t>blocked</w:t>
-            </w:r>
-            <w:r>
-              <w:rPr>
-                <w:i/>
-                <w:sz w:val="18"/>
-              </w:rPr>
-              <w:t>missing</w:t>
-            </w:r>
-            <w:r>
-              <w:rPr>
-                <w:sz w:val="18"/>
-              </w:rPr>
-              <w:t>dependency</w:t>
+              <w:t>metadata_only</w:t>
             </w:r>
           </w:p>
         </w:tc>
@@ -7723,7 +7710,7 @@
               <w:rPr>
                 <w:sz w:val="18"/>
               </w:rPr>
-              <w:t>A job needs a dependency.</w:t>
+              <w:t>Flux has only operational file metadata, not searchable extracted content.</w:t>
             </w:r>
           </w:p>
         </w:tc>
@@ -7746,7 +7733,7 @@
               <w:rPr>
                 <w:sz w:val="18"/>
               </w:rPr>
-              <w:t>Install/configure manually, then retry.</w:t>
+              <w:t>Accept only for limited pilot roots; for go-live roots, exclude the file type or install the extractor.</w:t>
             </w:r>
           </w:p>
         </w:tc>
@@ -7771,6 +7758,77 @@
               <w:rPr>
                 <w:sz w:val="18"/>
               </w:rPr>
+              <w:t>blocked missing dependency</w:t>
+            </w:r>
+          </w:p>
+        </w:tc>
+        <w:tc>
+          <w:tcPr>
+            <w:tcW w:type="dxa" w:w="2700"/>
+            <w:vAlign w:val="center"/>
+            <w:tcMar>
+              <w:top w:w="80" w:type="dxa"/>
+              <w:bottom w:w="80" w:type="dxa"/>
+              <w:start w:w="120" w:type="dxa"/>
+              <w:end w:w="120" w:type="dxa"/>
+            </w:tcMar>
+          </w:tcPr>
+          <w:p>
+            <w:pPr>
+              <w:spacing w:after="0" w:line="276" w:lineRule="auto"/>
+            </w:pPr>
+            <w:r>
+              <w:rPr>
+                <w:sz w:val="18"/>
+              </w:rPr>
+              <w:t>A job needs a dependency.</w:t>
+            </w:r>
+          </w:p>
+        </w:tc>
+        <w:tc>
+          <w:tcPr>
+            <w:tcW w:type="dxa" w:w="4560"/>
+            <w:vAlign w:val="center"/>
+            <w:tcMar>
+              <w:top w:w="80" w:type="dxa"/>
+              <w:bottom w:w="80" w:type="dxa"/>
+              <w:start w:w="120" w:type="dxa"/>
+              <w:end w:w="120" w:type="dxa"/>
+            </w:tcMar>
+          </w:tcPr>
+          <w:p>
+            <w:pPr>
+              <w:spacing w:after="0" w:line="276" w:lineRule="auto"/>
+            </w:pPr>
+            <w:r>
+              <w:rPr>
+                <w:sz w:val="18"/>
+              </w:rPr>
+              <w:t>Install/configure manually, then retry.</w:t>
+            </w:r>
+          </w:p>
+        </w:tc>
+      </w:tr>
+      <w:tr>
+        <w:tc>
+          <w:tcPr>
+            <w:tcW w:type="dxa" w:w="2100"/>
+            <w:vAlign w:val="center"/>
+            <w:tcMar>
+              <w:top w:w="80" w:type="dxa"/>
+              <w:bottom w:w="80" w:type="dxa"/>
+              <w:start w:w="120" w:type="dxa"/>
+              <w:end w:w="120" w:type="dxa"/>
+            </w:tcMar>
+          </w:tcPr>
+          <w:p>
+            <w:pPr>
+              <w:spacing w:after="0" w:line="276" w:lineRule="auto"/>
+            </w:pPr>
+            <w:r>
+              <w:rPr>
+                <w:sz w:val="18"/>
+              </w:rPr>
               <w:t>duplicate_suppressed</w:t>
             </w:r>
           </w:p>
@@ -7818,6 +7876,77 @@
                 <w:sz w:val="18"/>
               </w:rPr>
               <w:t>Usually no action.</w:t>
+            </w:r>
+          </w:p>
+        </w:tc>
+      </w:tr>
+      <w:tr>
+        <w:tc>
+          <w:tcPr>
+            <w:tcW w:type="dxa" w:w="2100"/>
+            <w:vAlign w:val="center"/>
+            <w:tcMar>
+              <w:top w:w="80" w:type="dxa"/>
+              <w:bottom w:w="80" w:type="dxa"/>
+              <w:start w:w="120" w:type="dxa"/>
+              <w:end w:w="120" w:type="dxa"/>
+            </w:tcMar>
+          </w:tcPr>
+          <w:p>
+            <w:pPr>
+              <w:spacing w:after="0" w:line="276" w:lineRule="auto"/>
+            </w:pPr>
+            <w:r>
+              <w:rPr>
+                <w:sz w:val="18"/>
+              </w:rPr>
+              <w:t>strict_indexing</w:t>
+            </w:r>
+          </w:p>
+        </w:tc>
+        <w:tc>
+          <w:tcPr>
+            <w:tcW w:type="dxa" w:w="2700"/>
+            <w:vAlign w:val="center"/>
+            <w:tcMar>
+              <w:top w:w="80" w:type="dxa"/>
+              <w:bottom w:w="80" w:type="dxa"/>
+              <w:start w:w="120" w:type="dxa"/>
+              <w:end w:w="120" w:type="dxa"/>
+            </w:tcMar>
+          </w:tcPr>
+          <w:p>
+            <w:pPr>
+              <w:spacing w:after="0" w:line="276" w:lineRule="auto"/>
+            </w:pPr>
+            <w:r>
+              <w:rPr>
+                <w:sz w:val="18"/>
+              </w:rPr>
+              <w:t>Root policy blocks metadata-only indexing.</w:t>
+            </w:r>
+          </w:p>
+        </w:tc>
+        <w:tc>
+          <w:tcPr>
+            <w:tcW w:type="dxa" w:w="4560"/>
+            <w:vAlign w:val="center"/>
+            <w:tcMar>
+              <w:top w:w="80" w:type="dxa"/>
+              <w:bottom w:w="80" w:type="dxa"/>
+              <w:start w:w="120" w:type="dxa"/>
+              <w:end w:w="120" w:type="dxa"/>
+            </w:tcMar>
+          </w:tcPr>
+          <w:p>
+            <w:pPr>
+              <w:spacing w:after="0" w:line="276" w:lineRule="auto"/>
+            </w:pPr>
+            <w:r>
+              <w:rPr>
+                <w:sz w:val="18"/>
+              </w:rPr>
+              <w:t>Use for broad or important go-live roots.</w:t>
             </w:r>
           </w:p>
         </w:tc>
@@ -8362,7 +8491,17 @@
         <w:spacing w:after="120"/>
       </w:pPr>
       <w:r>
-        <w:t>Use include/exclude globs to avoid indexing private exports, generated folders, caches, build outputs, or credentials. Use dry run when you are unsure what a sync will touch. Use backfill when jobs are known-safe and queued. Use Diagnostics when a job is blocked.</w:t>
+        <w:t xml:space="preserve">Use include/exclude globs to avoid indexing private exports, generated folders, caches, build outputs, or credentials. Use strict indexing for go-live roots so unsupported files become visible </w:t>
+      </w:r>
+      <w:r>
+        <w:rPr>
+          <w:rFonts w:ascii="Consolas" w:hAnsi="Consolas"/>
+          <w:sz w:val="18"/>
+        </w:rPr>
+        <w:t>blocked_missing_dependency</w:t>
+      </w:r>
+      <w:r>
+        <w:t xml:space="preserve"> work instead of silent metadata-only discovery. Use dry run when you are unsure what a sync will touch. Use backfill when jobs are known-safe and queued. Use Diagnostics when a job is blocked.</w:t>
       </w:r>
     </w:p>
     <w:p>
@@ -9028,6 +9167,77 @@
                 <w:sz w:val="18"/>
               </w:rPr>
               <w:t>Always exclude private, cache, build, and temp folders when relevant.</w:t>
+            </w:r>
+          </w:p>
+        </w:tc>
+      </w:tr>
+      <w:tr>
+        <w:tc>
+          <w:tcPr>
+            <w:tcW w:type="dxa" w:w="2100"/>
+            <w:vAlign w:val="center"/>
+            <w:tcMar>
+              <w:top w:w="80" w:type="dxa"/>
+              <w:bottom w:w="80" w:type="dxa"/>
+              <w:start w:w="120" w:type="dxa"/>
+              <w:end w:w="120" w:type="dxa"/>
+            </w:tcMar>
+          </w:tcPr>
+          <w:p>
+            <w:pPr>
+              <w:spacing w:after="0" w:line="276" w:lineRule="auto"/>
+            </w:pPr>
+            <w:r>
+              <w:rPr>
+                <w:sz w:val="18"/>
+              </w:rPr>
+              <w:t>Strict indexing</w:t>
+            </w:r>
+          </w:p>
+        </w:tc>
+        <w:tc>
+          <w:tcPr>
+            <w:tcW w:type="dxa" w:w="2700"/>
+            <w:vAlign w:val="center"/>
+            <w:tcMar>
+              <w:top w:w="80" w:type="dxa"/>
+              <w:bottom w:w="80" w:type="dxa"/>
+              <w:start w:w="120" w:type="dxa"/>
+              <w:end w:w="120" w:type="dxa"/>
+            </w:tcMar>
+          </w:tcPr>
+          <w:p>
+            <w:pPr>
+              <w:spacing w:after="0" w:line="276" w:lineRule="auto"/>
+            </w:pPr>
+            <w:r>
+              <w:rPr>
+                <w:sz w:val="18"/>
+              </w:rPr>
+              <w:t>Root metadata that blocks metadata-only retrieval behavior.</w:t>
+            </w:r>
+          </w:p>
+        </w:tc>
+        <w:tc>
+          <w:tcPr>
+            <w:tcW w:type="dxa" w:w="4560"/>
+            <w:vAlign w:val="center"/>
+            <w:tcMar>
+              <w:top w:w="80" w:type="dxa"/>
+              <w:bottom w:w="80" w:type="dxa"/>
+              <w:start w:w="120" w:type="dxa"/>
+              <w:end w:w="120" w:type="dxa"/>
+            </w:tcMar>
+          </w:tcPr>
+          <w:p>
+            <w:pPr>
+              <w:spacing w:after="0" w:line="276" w:lineRule="auto"/>
+            </w:pPr>
+            <w:r>
+              <w:rPr>
+                <w:sz w:val="18"/>
+              </w:rPr>
+              <w:t>On for broad or important roots; off only for limited pilots.</w:t>
             </w:r>
           </w:p>
         </w:tc>

</xml_diff>

<commit_message>
Fix Outlook COM mail profile UX
</commit_message>
<xml_diff>
--- a/docs/user-guide/Flux-LLM-KB-Dashboard-User-Manual.docx
+++ b/docs/user-guide/Flux-LLM-KB-Dashboard-User-Manual.docx
@@ -1233,20 +1233,14 @@
               <w:rPr>
                 <w:sz w:val="18"/>
               </w:rPr>
-              <w:t>Mail backoff or blocked</w:t>
-            </w:r>
-            <w:r>
-              <w:rPr>
-                <w:i/>
-                <w:sz w:val="18"/>
-              </w:rPr>
-              <w:t>auth</w:t>
-            </w:r>
-            <w:r>
-              <w:rPr>
-                <w:sz w:val="18"/>
-              </w:rPr>
-              <w:t>required</w:t>
+              <w:t xml:space="preserve">Mail backoff or </w:t>
+            </w:r>
+            <w:r>
+              <w:rPr>
+                <w:rFonts w:ascii="Consolas" w:hAnsi="Consolas"/>
+                <w:sz w:val="18"/>
+              </w:rPr>
+              <w:t>blocked_auth_required</w:t>
             </w:r>
           </w:p>
         </w:tc>
@@ -7685,6 +7679,7 @@
             </w:pPr>
             <w:r>
               <w:rPr>
+                <w:rFonts w:ascii="Consolas" w:hAnsi="Consolas"/>
                 <w:sz w:val="18"/>
               </w:rPr>
               <w:t>metadata_only</w:t>
@@ -7827,6 +7822,7 @@
             </w:pPr>
             <w:r>
               <w:rPr>
+                <w:rFonts w:ascii="Consolas" w:hAnsi="Consolas"/>
                 <w:sz w:val="18"/>
               </w:rPr>
               <w:t>duplicate_suppressed</w:t>
@@ -7898,6 +7894,7 @@
             </w:pPr>
             <w:r>
               <w:rPr>
+                <w:rFonts w:ascii="Consolas" w:hAnsi="Consolas"/>
                 <w:sz w:val="18"/>
               </w:rPr>
               <w:t>strict_indexing</w:t>
@@ -7969,6 +7966,7 @@
             </w:pPr>
             <w:r>
               <w:rPr>
+                <w:rFonts w:ascii="Consolas" w:hAnsi="Consolas"/>
                 <w:sz w:val="18"/>
               </w:rPr>
               <w:t>include_globs</w:t>
@@ -8040,6 +8038,7 @@
             </w:pPr>
             <w:r>
               <w:rPr>
+                <w:rFonts w:ascii="Consolas" w:hAnsi="Consolas"/>
                 <w:sz w:val="18"/>
               </w:rPr>
               <w:t>exclude_globs</w:t>
@@ -8111,6 +8110,7 @@
             </w:pPr>
             <w:r>
               <w:rPr>
+                <w:rFonts w:ascii="Consolas" w:hAnsi="Consolas"/>
                 <w:sz w:val="18"/>
               </w:rPr>
               <w:t>glob_mode inherit</w:t>
@@ -8182,6 +8182,7 @@
             </w:pPr>
             <w:r>
               <w:rPr>
+                <w:rFonts w:ascii="Consolas" w:hAnsi="Consolas"/>
                 <w:sz w:val="18"/>
               </w:rPr>
               <w:t>glob_mode extend</w:t>
@@ -8253,6 +8254,7 @@
             </w:pPr>
             <w:r>
               <w:rPr>
+                <w:rFonts w:ascii="Consolas" w:hAnsi="Consolas"/>
                 <w:sz w:val="18"/>
               </w:rPr>
               <w:t>glob_mode override</w:t>
@@ -9509,7 +9511,7 @@
           <w:color w:val="52627A"/>
           <w:sz w:val="17"/>
         </w:rPr>
-        <w:t>Figure: The Add Mail Profile form captures source type, account, folders, private spool path, sync cadence, and post-process policy.</w:t>
+        <w:t>Figure: The Add Mail Profile form is source-aware: IMAP profiles show account/server fields, while Outlook COM profiles use the local Outlook host and hide IMAP-only fields.</w:t>
       </w:r>
     </w:p>
     <w:p>
@@ -9975,7 +9977,7 @@
               <w:rPr>
                 <w:sz w:val="18"/>
               </w:rPr>
-              <w:t>Profile uses the local Outlook host.</w:t>
+              <w:t>Profile uses the local Windows Outlook host and the desktop Outlook profile, not an IMAP server.</w:t>
             </w:r>
           </w:p>
         </w:tc>
@@ -10376,22 +10378,10 @@
             </w:pPr>
             <w:r>
               <w:rPr>
-                <w:sz w:val="18"/>
-              </w:rPr>
-              <w:t>blocked</w:t>
-            </w:r>
-            <w:r>
-              <w:rPr>
-                <w:i/>
-                <w:sz w:val="18"/>
-              </w:rPr>
-              <w:t>auth</w:t>
-            </w:r>
-            <w:r>
-              <w:rPr>
-                <w:sz w:val="18"/>
-              </w:rPr>
-              <w:t>required</w:t>
+                <w:rFonts w:ascii="Consolas" w:hAnsi="Consolas"/>
+                <w:sz w:val="18"/>
+              </w:rPr>
+              <w:t>blocked_auth_required</w:t>
             </w:r>
           </w:p>
         </w:tc>
@@ -10460,6 +10450,7 @@
             </w:pPr>
             <w:r>
               <w:rPr>
+                <w:rFonts w:ascii="Consolas" w:hAnsi="Consolas"/>
                 <w:sz w:val="18"/>
               </w:rPr>
               <w:t>remove_label</w:t>
@@ -10531,22 +10522,10 @@
             </w:pPr>
             <w:r>
               <w:rPr>
-                <w:sz w:val="18"/>
-              </w:rPr>
-              <w:t>move</w:t>
-            </w:r>
-            <w:r>
-              <w:rPr>
-                <w:i/>
-                <w:sz w:val="18"/>
-              </w:rPr>
-              <w:t>to</w:t>
-            </w:r>
-            <w:r>
-              <w:rPr>
-                <w:sz w:val="18"/>
-              </w:rPr>
-              <w:t>processed</w:t>
+                <w:rFonts w:ascii="Consolas" w:hAnsi="Consolas"/>
+                <w:sz w:val="18"/>
+              </w:rPr>
+              <w:t>move_to_processed</w:t>
             </w:r>
           </w:p>
         </w:tc>
@@ -10615,6 +10594,7 @@
             </w:pPr>
             <w:r>
               <w:rPr>
+                <w:rFonts w:ascii="Consolas" w:hAnsi="Consolas"/>
                 <w:sz w:val="18"/>
               </w:rPr>
               <w:t>none</w:t>
@@ -10663,7 +10643,7 @@
               <w:rPr>
                 <w:sz w:val="18"/>
               </w:rPr>
-              <w:t>Safest default.</w:t>
+              <w:t>Safest default and the only supported Outlook COM post-process policy.</w:t>
             </w:r>
           </w:p>
         </w:tc>
@@ -10686,6 +10666,7 @@
             </w:pPr>
             <w:r>
               <w:rPr>
+                <w:rFonts w:ascii="Consolas" w:hAnsi="Consolas"/>
                 <w:sz w:val="18"/>
               </w:rPr>
               <w:t>trash/delete</w:t>
@@ -10915,6 +10896,23 @@
       </w:pPr>
       <w:r>
         <w:t>Use dry-run before changing post-process policy. Do not use destructive post-process actions unless you have tested the profile and understand the mailbox effect.</w:t>
+      </w:r>
+    </w:p>
+    <w:p>
+      <w:pPr>
+        <w:spacing w:after="120"/>
+      </w:pPr>
+      <w:r>
+        <w:t xml:space="preserve">Outlook COM profiles are different from IMAP profiles. They do not need an account or server value in Flux; classic Outlook already owns the mailbox connection. Keep post-process set to </w:t>
+      </w:r>
+      <w:r>
+        <w:rPr>
+          <w:b/>
+        </w:rPr>
+        <w:t>Leave in place</w:t>
+      </w:r>
+      <w:r>
+        <w:t xml:space="preserve"> for Outlook COM. The interval field appears only when scheduled sync is enabled; one-time/manual sync does not use it.</w:t>
       </w:r>
     </w:p>
     <w:p>
@@ -17881,7 +17879,7 @@
         <w:ind w:left="461" w:hanging="461"/>
       </w:pPr>
       <w:r>
-        <w:t>4. Enter account, folders, and private spool path.</w:t>
+        <w:t>4. For IMAP, enter account, server, folders or labels, and private spool path.</w:t>
       </w:r>
     </w:p>
     <w:p>
@@ -17890,7 +17888,7 @@
         <w:ind w:left="461" w:hanging="461"/>
       </w:pPr>
       <w:r>
-        <w:t>5. Keep scheduled sync disabled until the profile is tested.</w:t>
+        <w:t>5. For Outlook COM, enter the Outlook folder path and private spool path; no IMAP server is needed.</w:t>
       </w:r>
     </w:p>
     <w:p>
@@ -17899,16 +17897,7 @@
         <w:ind w:left="461" w:hanging="461"/>
       </w:pPr>
       <w:r>
-        <w:t>6. Use post</w:t>
-      </w:r>
-      <w:r>
-        <w:rPr>
-          <w:i/>
-        </w:rPr>
-        <w:t>process</w:t>
-      </w:r>
-      <w:r>
-        <w:t>policy none until you have run dry-runs.</w:t>
+        <w:t>6. Keep scheduled sync disabled until the profile is tested. Interval seconds matters only when scheduled sync is enabled.</w:t>
       </w:r>
     </w:p>
     <w:p>
@@ -17917,7 +17906,37 @@
         <w:ind w:left="461" w:hanging="461"/>
       </w:pPr>
       <w:r>
-        <w:t>7. Save the profile.</w:t>
+        <w:t xml:space="preserve">7. Use </w:t>
+      </w:r>
+      <w:r>
+        <w:rPr>
+          <w:rFonts w:ascii="Consolas" w:hAnsi="Consolas"/>
+          <w:sz w:val="18"/>
+        </w:rPr>
+        <w:t>post_process_policy</w:t>
+      </w:r>
+      <w:r>
+        <w:t xml:space="preserve"> </w:t>
+      </w:r>
+      <w:r>
+        <w:rPr>
+          <w:rFonts w:ascii="Consolas" w:hAnsi="Consolas"/>
+          <w:sz w:val="18"/>
+        </w:rPr>
+        <w:t>none</w:t>
+      </w:r>
+      <w:r>
+        <w:t xml:space="preserve"> until you have run dry-runs. For Outlook COM, keep post-process as </w:t>
+      </w:r>
+      <w:r>
+        <w:rPr>
+          <w:rFonts w:ascii="Consolas" w:hAnsi="Consolas"/>
+          <w:sz w:val="18"/>
+        </w:rPr>
+        <w:t>none</w:t>
+      </w:r>
+      <w:r>
+        <w:t>.</w:t>
       </w:r>
     </w:p>
     <w:p>
@@ -17926,7 +17945,7 @@
         <w:ind w:left="461" w:hanging="461"/>
       </w:pPr>
       <w:r>
-        <w:t>8. For Gmail, save OAuth client JSON path and start OAuth manually.</w:t>
+        <w:t>8. Save the profile.</w:t>
       </w:r>
     </w:p>
     <w:p>
@@ -17935,7 +17954,7 @@
         <w:ind w:left="461" w:hanging="461"/>
       </w:pPr>
       <w:r>
-        <w:t>9. Run Sync Now or a profile sync.</w:t>
+        <w:t>9. For Gmail, save OAuth client JSON path and start OAuth manually.</w:t>
       </w:r>
     </w:p>
     <w:p>
@@ -17944,7 +17963,16 @@
         <w:ind w:left="461" w:hanging="461"/>
       </w:pPr>
       <w:r>
-        <w:t>10. Review capture jobs in Review before ingestion.</w:t>
+        <w:t>10. Run Sync Now or a profile sync.</w:t>
+      </w:r>
+    </w:p>
+    <w:p>
+      <w:pPr>
+        <w:spacing w:after="80"/>
+        <w:ind w:left="461" w:hanging="461"/>
+      </w:pPr>
+      <w:r>
+        <w:t>11. Review capture jobs in Review before ingestion.</w:t>
       </w:r>
     </w:p>
     <w:p>
@@ -19308,22 +19336,10 @@
             </w:pPr>
             <w:r>
               <w:rPr>
-                <w:sz w:val="18"/>
-              </w:rPr>
-              <w:t>blocked</w:t>
-            </w:r>
-            <w:r>
-              <w:rPr>
-                <w:i/>
-                <w:sz w:val="18"/>
-              </w:rPr>
-              <w:t>auth</w:t>
-            </w:r>
-            <w:r>
-              <w:rPr>
-                <w:sz w:val="18"/>
-              </w:rPr>
-              <w:t>required</w:t>
+                <w:rFonts w:ascii="Consolas" w:hAnsi="Consolas"/>
+                <w:sz w:val="18"/>
+              </w:rPr>
+              <w:t>blocked_auth_required</w:t>
             </w:r>
           </w:p>
         </w:tc>

</xml_diff>